<commit_message>
Some edits to proposal draft
</commit_message>
<xml_diff>
--- a/Project_proposal.docx
+++ b/Project_proposal.docx
@@ -4,10 +4,13 @@
   <w:body>
     <w:p>
       <w:r>
-        <w:t>My proposed project is the</w:t>
-      </w:r>
-      <w:r>
-        <w:t xml:space="preserve"> development of an inferential model for the load</w:t>
+        <w:t xml:space="preserve">My proposed project is </w:t>
+      </w:r>
+      <w:r>
+        <w:t>prediction of the</w:t>
+      </w:r>
+      <w:r>
+        <w:t xml:space="preserve"> load</w:t>
       </w:r>
       <w:r>
         <w:t xml:space="preserve"> </w:t>
@@ -16,18 +19,75 @@
         <w:t>response of cadaveric cervical spine segments to induced pure shear displacements</w:t>
       </w:r>
       <w:r>
-        <w:t xml:space="preserve">. Figure a) shows the basic setup for a single experiment. </w:t>
-      </w:r>
-      <w:r>
-        <w:t>The experiments feature six test conditions, with loads applied in two directions (anterior and posterior) and three displacement rates (1, 10, and 100 mm/s)</w:t>
-      </w:r>
-      <w:r>
-        <w:t>. Each specimen originates from a different donor, and the experiments are carried out non-destructively such that every specimen experiences all six test conditions.</w:t>
-      </w:r>
-      <w:r>
-        <w:t xml:space="preserve"> Ultimately, each experiment produces a nx2 vector containing</w:t>
+        <w:t xml:space="preserve">. </w:t>
+      </w:r>
+      <w:r>
+        <w:t>This is data based on experiments from my research: these</w:t>
+      </w:r>
+      <w:r>
+        <w:t xml:space="preserve"> experiments feature six test conditions,</w:t>
+      </w:r>
+      <w:r>
+        <w:t xml:space="preserve"> where displacements are </w:t>
+      </w:r>
+      <w:r>
+        <w:t>applied in two directions (anterior and posterior) and</w:t>
+      </w:r>
+      <w:r>
+        <w:t xml:space="preserve"> at</w:t>
+      </w:r>
+      <w:r>
+        <w:t xml:space="preserve"> three displacement rates (1, 10, and 100 mm/s)</w:t>
+      </w:r>
+      <w:r>
+        <w:t xml:space="preserve">. Each specimen originates from a different </w:t>
+      </w:r>
+      <w:r>
+        <w:t xml:space="preserve">human </w:t>
+      </w:r>
+      <w:r>
+        <w:t>donor, and the experiments are carried out non-destructively such that every specimen experiences all six test conditions.</w:t>
+      </w:r>
+      <w:r>
+        <w:t xml:space="preserve"> </w:t>
       </w:r>
     </w:p>
+    <w:p>
+      <w:r>
+        <w:t xml:space="preserve">The data files contain a number of parameters recorded in each test, but for this project I am only interested in the X-axis displacements and corresponding loads. The head of a </w:t>
+      </w:r>
+      <w:proofErr w:type="spellStart"/>
+      <w:r>
+        <w:t>dataframe</w:t>
+      </w:r>
+      <w:proofErr w:type="spellEnd"/>
+      <w:r>
+        <w:t xml:space="preserve"> for one of the experiments is shown below; we are interested in the variables </w:t>
+      </w:r>
+      <w:proofErr w:type="spellStart"/>
+      <w:r>
+        <w:rPr>
+          <w:rFonts w:ascii="Courier Std" w:hAnsi="Courier Std"/>
+        </w:rPr>
+        <w:t>disp_x_mm</w:t>
+      </w:r>
+      <w:proofErr w:type="spellEnd"/>
+      <w:r>
+        <w:t xml:space="preserve"> and </w:t>
+      </w:r>
+      <w:proofErr w:type="spellStart"/>
+      <w:r>
+        <w:rPr>
+          <w:rFonts w:ascii="Courier Std" w:hAnsi="Courier Std"/>
+        </w:rPr>
+        <w:t>Fx_N</w:t>
+      </w:r>
+      <w:proofErr w:type="spellEnd"/>
+      <w:r>
+        <w:t>.</w:t>
+      </w:r>
+    </w:p>
+    <w:p/>
     <w:p>
       <w:r>
         <w:t xml:space="preserve">This model will be developed with the specific objective of enabling any other researcher to obtain the inferred load-displacement response for </w:t>

</xml_diff>

<commit_message>
Added link to git repo
</commit_message>
<xml_diff>
--- a/Project_proposal.docx
+++ b/Project_proposal.docx
@@ -40,7 +40,13 @@
         <w:t xml:space="preserve">This </w:t>
       </w:r>
       <w:r>
-        <w:t>data is from</w:t>
+        <w:t xml:space="preserve">data </w:t>
+      </w:r>
+      <w:r>
+        <w:t xml:space="preserve">comes </w:t>
+      </w:r>
+      <w:r>
+        <w:t>from</w:t>
       </w:r>
       <w:r>
         <w:t xml:space="preserve"> experiments </w:t>
@@ -49,7 +55,13 @@
         <w:t xml:space="preserve">in </w:t>
       </w:r>
       <w:r>
-        <w:t>my research</w:t>
+        <w:t xml:space="preserve">my </w:t>
+      </w:r>
+      <w:r>
+        <w:t xml:space="preserve">own </w:t>
+      </w:r>
+      <w:r>
+        <w:t>research</w:t>
       </w:r>
       <w:r>
         <w:t>, and is intended to further our understanding of human spine biomechanics as well as provide validation data for Finite Element (FE) models of the human neck.</w:t>
@@ -196,7 +208,13 @@
         <w:t xml:space="preserve">Each specimen has a number of associated covariates, including </w:t>
       </w:r>
       <w:r>
-        <w:t xml:space="preserve">the test conditions and intrinsic characteristics of the specimen (such as donor age, sex, etc.), and these details are contained in a single </w:t>
+        <w:t>the test conditions and intrinsic characteristics of the specimen (such as donor age, sex, etc.), and these details are contained in a</w:t>
+      </w:r>
+      <w:r>
+        <w:t>nother</w:t>
+      </w:r>
+      <w:r>
+        <w:t xml:space="preserve"> </w:t>
       </w:r>
       <w:proofErr w:type="spellStart"/>
       <w:r>
@@ -204,7 +222,13 @@
       </w:r>
       <w:proofErr w:type="spellEnd"/>
       <w:r>
-        <w:t>. In addition to the covariates, there is also a variable containing the filenames for the corresponding test data.</w:t>
+        <w:t>. In addition to the covariates, there is also a variable containing the filenames for the corresponding</w:t>
+      </w:r>
+      <w:r>
+        <w:t xml:space="preserve"> experimental data</w:t>
+      </w:r>
+      <w:r>
+        <w:t>.</w:t>
       </w:r>
     </w:p>
     <w:p>
@@ -263,23 +287,57 @@
     </w:p>
     <w:p>
       <w:r>
-        <w:t>The model will be developed in Stan, starting with a fairly simple non-hierarchical approach.  Since the data is non-linear, I will experiment using a quadratic and exponential model, both of which I expect to perform well for the data in question. I will follow the overall workflow</w:t>
+        <w:t>The model will be developed in Stan, starting with a fairly simple non-hierarchical approach</w:t>
+      </w:r>
+      <w:r>
+        <w:t>, but potentially switching to a hierarchical model depending on prior sensitivity</w:t>
+      </w:r>
+      <w:r>
+        <w:t>.  Since the data is non-linear, I will experiment</w:t>
+      </w:r>
+      <w:r>
+        <w:t xml:space="preserve"> with</w:t>
+      </w:r>
+      <w:r>
+        <w:t xml:space="preserve"> using a quadratic and </w:t>
+      </w:r>
+      <w:r>
+        <w:t xml:space="preserve">an </w:t>
+      </w:r>
+      <w:r>
+        <w:t>exponential model, both of which I expect to perform well for the data in question</w:t>
+      </w:r>
+      <w:r>
+        <w:t>, and make a choice based on performance an interpretability of results for a biomedical audience</w:t>
+      </w:r>
+      <w:r>
+        <w:t>. I will follow the overall workflow</w:t>
       </w:r>
       <w:r>
         <w:t xml:space="preserve"> outlined by </w:t>
       </w:r>
-      <w:proofErr w:type="spellStart"/>
-      <w:r>
-        <w:t>gelman</w:t>
-      </w:r>
-      <w:proofErr w:type="spellEnd"/>
-      <w:r>
-        <w:t xml:space="preserve"> et al and implement different approaches as appropriate – I expect to spend a fair amount of time evaluating the model for prediction using cross-validation and posterior prediction checks.</w:t>
+      <w:r>
+        <w:t>G</w:t>
+      </w:r>
+      <w:r>
+        <w:t>elman et al</w:t>
+      </w:r>
+      <w:r>
+        <w:t>. (2020)</w:t>
+      </w:r>
+      <w:r>
+        <w:t xml:space="preserve"> and implement different approaches as appropriate – I expect to spend </w:t>
+      </w:r>
+      <w:r>
+        <w:lastRenderedPageBreak/>
+        <w:t>a fair amount of time evaluating the model for prediction using cross-validation and posterior prediction</w:t>
+      </w:r>
+      <w:r>
+        <w:t xml:space="preserve"> checks.</w:t>
       </w:r>
     </w:p>
     <w:p>
       <w:r>
-        <w:lastRenderedPageBreak/>
         <w:t>Th</w:t>
       </w:r>
       <w:r>
@@ -348,6 +406,29 @@
       <w:r>
         <w:t>.</w:t>
       </w:r>
+    </w:p>
+    <w:p>
+      <w:r>
+        <w:t xml:space="preserve">The project can be found in the following </w:t>
+      </w:r>
+      <w:proofErr w:type="spellStart"/>
+      <w:r>
+        <w:t>github</w:t>
+      </w:r>
+      <w:proofErr w:type="spellEnd"/>
+      <w:r>
+        <w:t xml:space="preserve"> repo, which also contains all of the test data.</w:t>
+      </w:r>
+    </w:p>
+    <w:p>
+      <w:hyperlink r:id="rId6" w:history="1">
+        <w:r>
+          <w:rPr>
+            <w:rStyle w:val="Hyperlink"/>
+          </w:rPr>
+          <w:t>https://github.com/luidias/STAT447C-Project</w:t>
+        </w:r>
+      </w:hyperlink>
     </w:p>
     <w:p/>
     <w:sectPr>
@@ -1277,6 +1358,29 @@
       <w:spacing w:val="5"/>
     </w:rPr>
   </w:style>
+  <w:style w:type="character" w:styleId="Hyperlink">
+    <w:name w:val="Hyperlink"/>
+    <w:basedOn w:val="DefaultParagraphFont"/>
+    <w:uiPriority w:val="99"/>
+    <w:unhideWhenUsed/>
+    <w:rsid w:val="00CA7D8E"/>
+    <w:rPr>
+      <w:color w:val="467886" w:themeColor="hyperlink"/>
+      <w:u w:val="single"/>
+    </w:rPr>
+  </w:style>
+  <w:style w:type="character" w:styleId="UnresolvedMention">
+    <w:name w:val="Unresolved Mention"/>
+    <w:basedOn w:val="DefaultParagraphFont"/>
+    <w:uiPriority w:val="99"/>
+    <w:semiHidden/>
+    <w:unhideWhenUsed/>
+    <w:rsid w:val="00CA7D8E"/>
+    <w:rPr>
+      <w:color w:val="605E5C"/>
+      <w:shd w:val="clear" w:color="auto" w:fill="E1DFDD"/>
+    </w:rPr>
+  </w:style>
 </w:styles>
 </file>
 

</xml_diff>